<commit_message>
v1.1.0: stability analysis of the flow reactor, conversion-dependent delay, exact storage bound with domain, frozen-conversion criticality, energy-conserving integrator, convergence studies, revised cover letter
Co-Authored-By: Claude Sonnet 5.5 <noreply@anthropic.com>
</commit_message>
<xml_diff>
--- a/manuscript/Cover_Letter_JCP.docx
+++ b/manuscript/Cover_Letter_JCP.docx
@@ -44,7 +44,7 @@
         <w:spacing w:after="120"/>
       </w:pPr>
       <w:r>
-        <w:t>6 October 2026</w:t>
+        <w:t>7 October 2026</w:t>
       </w:r>
     </w:p>
     <w:p>
@@ -81,7 +81,7 @@
         <w:spacing w:after="120"/>
       </w:pPr>
       <w:r>
-        <w:t>I submit the enclosed theoretical paper for consideration in The Journal of Chemical Physics, in the section on Polymers and Soft Matter (the Theoretical Methods and Algorithms section would also be appropriate). It treats a problem of reaction dynamics: a cure that is triggered by the melting of an encapsulated catalyst, with a distribution of capsule melting temperatures, autocatalytic kinetics and exothermic feedback on the temperature. The central result is that this lumped model is largely solvable in closed form.</w:t>
+        <w:t>I submit the enclosed theoretical paper for consideration in The Journal of Chemical Physics, in the section on Polymers and Soft Matter (Theoretical Methods and Algorithms would also be appropriate). It concerns the reaction dynamics of a cure triggered by the melting of an encapsulated catalyst, with a distribution of capsule melting temperatures, autocatalytic kinetics and exothermic feedback. The paper is purely theoretical: no experimental data are used and all parameters are illustrative.</w:t>
       </w:r>
     </w:p>
     <w:p>
@@ -92,7 +92,15 @@
         <w:rPr>
           <w:b/>
         </w:rPr>
-        <w:t>What the paper establishes</w:t>
+        <w:t>What is new, and what is not</w:t>
+      </w:r>
+    </w:p>
+    <w:p>
+      <w:pPr>
+        <w:spacing w:after="60"/>
+      </w:pPr>
+      <w:r>
+        <w:t>Several ingredients are standard, and the paper says so: separable cure kinetics with a generalized time, the Semenov and Frank-Kamenetskii fold, its extension to reactant consumption, and the multiplicity and stability analysis of continuous stirred reactors. The new content is their assembly for a melt-gated autocatalytic cure, with results of three different kinds that the manuscript keeps apart:</w:t>
       </w:r>
     </w:p>
     <w:p>
@@ -101,7 +109,31 @@
         <w:spacing w:after="60"/>
       </w:pPr>
       <w:r>
-        <w:t>At constant temperature the gated cure is exactly the isothermal cure evaluated on the clock of integrated catalyst availability, so the gate delays every conversion level by essentially the release time constant (Proposition 1).</w:t>
+        <w:rPr>
+          <w:i/>
+        </w:rPr>
+        <w:t>Exact results.</w:t>
+      </w:r>
+      <w:r>
+        <w:t xml:space="preserve"> At constant temperature the gated cure is the isothermal cure on the clock of integrated catalyst availability; for a fully activated population the delay is τ</w:t>
+      </w:r>
+      <w:r>
+        <w:rPr>
+          <w:vertAlign w:val="subscript"/>
+        </w:rPr>
+        <w:t>rel</w:t>
+      </w:r>
+      <w:r>
+        <w:t>[1 − exp(−t/τ</w:t>
+      </w:r>
+      <w:r>
+        <w:rPr>
+          <w:vertAlign w:val="subscript"/>
+        </w:rPr>
+        <w:t>rel</w:t>
+      </w:r>
+      <w:r>
+        <w:t>)], which depends on conversion and approaches the release time constant only at late conversion. The isothermal cure time is exact by quadrature. The steady states of the flow reactor and the Jacobian are exact for the stated model.</w:t>
       </w:r>
     </w:p>
     <w:p>
@@ -110,7 +142,58 @@
         <w:spacing w:after="60"/>
       </w:pPr>
       <w:r>
-        <w:t>The isothermal cure time is exact by one quadrature for any reaction order and in closed form for first order; sharpness obeys a logarithmic law in the rate-constant ratio (Proposition 2).</w:t>
+        <w:rPr>
+          <w:i/>
+        </w:rPr>
+        <w:t>Closed forms with stated approximations.</w:t>
+      </w:r>
+      <w:r>
+        <w:t xml:space="preserve"> The storage conversion of a Gaussian capsule population, (a/b)[exp(b f t</w:t>
+      </w:r>
+      <w:r>
+        <w:rPr>
+          <w:vertAlign w:val="subscript"/>
+        </w:rPr>
+        <w:t>eff</w:t>
+      </w:r>
+      <w:r>
+        <w:t>) − 1] with f = Φ(−Δ/σ</w:t>
+      </w:r>
+      <w:r>
+        <w:rPr>
+          <w:vertAlign w:val="subscript"/>
+        </w:rPr>
+        <w:t>eff</w:t>
+      </w:r>
+      <w:r>
+        <w:t>), and the bound on the melting-temperature spread that follows from it (agreement with the full population equations within 3 % over the tested grid). The frozen-conversion critical number (1+n)</w:t>
+      </w:r>
+      <w:r>
+        <w:rPr>
+          <w:vertAlign w:val="superscript"/>
+        </w:rPr>
+        <w:t>1+n</w:t>
+      </w:r>
+      <w:r>
+        <w:t>/[e n</w:t>
+      </w:r>
+      <w:r>
+        <w:rPr>
+          <w:vertAlign w:val="superscript"/>
+        </w:rPr>
+        <w:t>n</w:t>
+      </w:r>
+      <w:r>
+        <w:t>(1+ε)</w:t>
+      </w:r>
+      <w:r>
+        <w:rPr>
+          <w:vertAlign w:val="superscript"/>
+        </w:rPr>
+        <w:t>1+n</w:t>
+      </w:r>
+      <w:r>
+        <w:t>] of the thermal balance, with an Arrhenius correction that agrees with integrations to a few percent over the tested range.</w:t>
       </w:r>
     </w:p>
     <w:p>
@@ -119,33 +202,13 @@
         <w:spacing w:after="60"/>
       </w:pPr>
       <w:r>
-        <w:t>The storage conversion of a Gaussian capsule population has a closed form in the open fraction Φ(−Δ/σ_eff), and inverts into a design rule for the largest admissible spread of melting temperatures that agrees with the population equations within 3 % (Proposition 3).</w:t>
+        <w:rPr>
+          <w:i/>
+        </w:rPr>
+        <w:t>Numerical evidence.</w:t>
       </w:r>
-    </w:p>
-    <w:p>
-      <w:pPr>
-        <w:pStyle w:val="ListBullet"/>
-        <w:spacing w:after="60"/>
-      </w:pPr>
       <w:r>
-        <w:t>Thermal feedback has a critical number Π_c = ψΘ = e⁻¹(1+n)^(1+n)/n^n at a fold of the quasi-steady manifold, with overshoot given by the Lambert W function, a square-root normal form, and an Arrhenius correction exp(1/Ar) (Proposition 4).</w:t>
-      </w:r>
-    </w:p>
-    <w:p>
-      <w:pPr>
-        <w:pStyle w:val="ListBullet"/>
-        <w:spacing w:after="60"/>
-      </w:pPr>
-      <w:r>
-        <w:t>In a continuous-flow reactor the same fold gives an ignition–extinction hysteresis with a computed existence threshold, and the loop area extrapolates to the static value as the sweep rate vanishes (Proposition 5).</w:t>
-      </w:r>
-    </w:p>
-    <w:p>
-      <w:pPr>
-        <w:spacing w:after="120"/>
-      </w:pPr>
-      <w:r>
-        <w:t>Every result is tested against the full equations. The paper also states the status and failure modes of each claim, and its falsifiable signatures.</w:t>
+        <w:t xml:space="preserve"> Operational ignition thresholds from integrations; the window of two stable states of the flow reactor, whose upper branch can lose stability at a Hopf-type point before its fold (ψ = 20: the stable window starts at ln D = -5.45 rather than at the fold, and finite-rate sweep loops approach the attractor loop area 5.05 slowly). The manuscript states where each result has been tested and where it has not.</w:t>
       </w:r>
     </w:p>
     <w:p>
@@ -156,7 +219,7 @@
         <w:rPr>
           <w:b/>
         </w:rPr>
-        <w:t>Scope and honesty about it</w:t>
+        <w:t>Chemical-physics significance</w:t>
       </w:r>
     </w:p>
     <w:p>
@@ -164,7 +227,26 @@
         <w:spacing w:after="120"/>
       </w:pPr>
       <w:r>
-        <w:t>The paper is purely theoretical and no experimental data are used; all parameters are illustrative and are not fitted to any material. I have tried to state this plainly throughout, including in a table of the status of every claim. The parameter set and the capsule-population picture were introduced in a numerical study that I posted as a preprint (ChemRxiv 10.26434/chemrxiv.15008366; Zenodo 10.5281/zenodo.22073390); the analytic results here are new, and the comparisons of that study are not used. That preprint is cited in the manuscript.</w:t>
+        <w:t>For encapsulated-catalyst and latent-cure systems, the quantities a calorimeter measures (rate constants, the width of the melting endotherm, a thermal time constant) enter the storage, delay and runaway behavior through a small number of closed-form relations, and the manuscript states them with their domains of validity and the signatures that would test them. Whether these model reductions constitute a sufficient advance for the Journal is for the Editors to judge; I have tried to make the claims no stronger than the checks that support them.</w:t>
+      </w:r>
+    </w:p>
+    <w:p>
+      <w:pPr>
+        <w:spacing w:after="60"/>
+      </w:pPr>
+      <w:r>
+        <w:rPr>
+          <w:b/>
+        </w:rPr>
+        <w:t>Relation to an earlier preprint</w:t>
+      </w:r>
+    </w:p>
+    <w:p>
+      <w:pPr>
+        <w:spacing w:after="120"/>
+      </w:pPr>
+      <w:r>
+        <w:t>The parameter set (rate constants and orders, release rate constant, logistic activation and mean melting temperature, adiabatic rise), the capsule-population picture and the reference integrator come from a numerical study that I posted as a preprint (ChemRxiv 10.26434/chemrxiv.15008366; Zenodo 10.5281/zenodo.22073390) and cite. The closed forms, the stability analysis and the verification here are new; the control-family comparisons of that preprint are not used.</w:t>
       </w:r>
     </w:p>
     <w:p>
@@ -183,7 +265,7 @@
         <w:spacing w:after="120"/>
       </w:pPr>
       <w:r>
-        <w:t>All code, tests and figure scripts are public at https://github.com/sandlerleon/gated-autocatalysis-criticality and archived at https://doi.org/10.5281/zenodo.23201763; the manuscript is available as a preprint at https://doi.org/10.5281/zenodo.23201767. A large language model (Claude, Anthropic) assisted with derivations, code, figures and drafting; I reviewed and verified the content, checked every closed-form result against the numerical model, resolved every journal reference through Crossref, and take full responsibility, as stated in the manuscript. I am the sole author, have no competing interests and received no funding. The manuscript is not under consideration elsewhere.</w:t>
+        <w:t>All code, tests, raw result tables and figure scripts are public at https://github.com/sandlerleon/gated-autocatalysis-criticality (release v1.1.0) and archived at https://doi.org/10.5281/zenodo.23225439; the manuscript is available as a preprint at https://doi.org/10.5281/zenodo.23225440. The manuscript describes in Section II C the use of Claude Sonnet 5.5 (Anthropic), used through the Claude Code command-line environment, for derivations, code, figures and drafting, and states that every number is produced by the released scripts. I am the sole author, have no competing interests and received no funding. The manuscript is not under consideration elsewhere.</w:t>
       </w:r>
     </w:p>
     <w:p>

</xml_diff>

<commit_message>
v1.2.0: physical Arrhenius temperature path, Hopf analysis, noise-dependent exit, provenance table, qualified convergence claim, 41 tests
Co-Authored-By: Claude Sonnet 5.5 <noreply@anthropic.com>
</commit_message>
<xml_diff>
--- a/manuscript/Cover_Letter_JCP.docx
+++ b/manuscript/Cover_Letter_JCP.docx
@@ -208,7 +208,7 @@
         <w:t>Numerical evidence.</w:t>
       </w:r>
       <w:r>
-        <w:t xml:space="preserve"> Operational ignition thresholds from integrations; the window of two stable states of the flow reactor, whose upper branch can lose stability at a Hopf-type point before its fold (ψ = 20: the stable window starts at ln D = -5.45 rather than at the fold, and finite-rate sweep loops approach the attractor loop area 5.05 slowly). The manuscript states where each result has been tested and where it has not.</w:t>
+        <w:t xml:space="preserve"> Operational ignition thresholds from integrations; the window of two stable states of the flow reactor, whose upper branch can lose stability at a Hopf-type point before its fold (ψ = 20: the stable window starts at ln D = -5.45 rather than at the fold; sweep loops through that point depend on noise and sweep rate and are not shown to converge to the attractor loop area 5.05; an Arrhenius temperature-path simulation gives a window of 24.2 K for the illustrative parameters). The manuscript states where each result has been tested and where it has not.</w:t>
       </w:r>
     </w:p>
     <w:p>
@@ -265,7 +265,7 @@
         <w:spacing w:after="120"/>
       </w:pPr>
       <w:r>
-        <w:t>All code, tests, raw result tables and figure scripts are public at https://github.com/sandlerleon/gated-autocatalysis-criticality (release v1.1.0) and archived at https://doi.org/10.5281/zenodo.23225439; the manuscript is available as a preprint at https://doi.org/10.5281/zenodo.23225440. The manuscript describes in Section II C the use of Claude Sonnet 5.5 (Anthropic), used through the Claude Code command-line environment, for derivations, code, figures and drafting, and states that every number is produced by the released scripts. I am the sole author, have no competing interests and received no funding. The manuscript is not under consideration elsewhere.</w:t>
+        <w:t>All code, tests, raw result tables and figure scripts are public at https://github.com/sandlerleon/gated-autocatalysis-criticality (release v1.2.0) and archived at https://doi.org/10.5281/zenodo.23226528; the manuscript is available as a preprint at https://doi.org/10.5281/zenodo.23226529. The manuscript describes in Section II C the use of Claude Sonnet 5.5 (Anthropic; model identifier as reported by the Claude Code environment of the Claude desktop application) for derivations, code, figures and drafting, and states that every number is produced by the released scripts. I am the sole author, have no competing interests and received no funding. The manuscript is not under consideration elsewhere.</w:t>
       </w:r>
     </w:p>
     <w:p>

</xml_diff>